<commit_message>
added GitHub and collaboration document
</commit_message>
<xml_diff>
--- a/github&collaboration/Github and collaboration.docx
+++ b/github&collaboration/Github and collaboration.docx
@@ -1308,6 +1308,69 @@
       </w:r>
     </w:p>
     <w:p>
+      <w:r>
+        <w:t xml:space="preserve">As the GitHub and Collaboration Lead, I was responsible for managing the project repository and coordinating the integration of team contributions. A GitHub repository named </w:t>
+      </w:r>
+      <w:r>
+        <w:rPr>
+          <w:b/>
+          <w:bCs/>
+        </w:rPr>
+        <w:t>dev-practical-group</w:t>
+      </w:r>
+      <w:r>
+        <w:t xml:space="preserve"> was used as the central platform for collaboration, and team members were added as collaborators to contribute their work.</w:t>
+      </w:r>
+    </w:p>
+    <w:p>
+      <w:r>
+        <w:t>The repository was cloned using Git Bash and used to organize project files received from team members. Git commands were used to monitor repository status, fetch updates, manage branches, and integrate contributions into the main branch.</w:t>
+      </w:r>
+    </w:p>
+    <w:p>
+      <w:r>
+        <w:t xml:space="preserve">Project files, including Docker, Chef, testing documentation, and Git-related evidence, were organized into the repository structure. Changes were committed and pushed to GitHub to maintain an </w:t>
+      </w:r>
+      <w:proofErr w:type="gramStart"/>
+      <w:r>
+        <w:t>up</w:t>
+      </w:r>
+      <w:r>
+        <w:t xml:space="preserve"> </w:t>
+      </w:r>
+      <w:r>
+        <w:t>to</w:t>
+      </w:r>
+      <w:r>
+        <w:t xml:space="preserve"> </w:t>
+      </w:r>
+      <w:r>
+        <w:t>date</w:t>
+      </w:r>
+      <w:proofErr w:type="gramEnd"/>
+      <w:r>
+        <w:t xml:space="preserve"> version of the project.</w:t>
+      </w:r>
+    </w:p>
+    <w:p>
+      <w:r>
+        <w:t xml:space="preserve">These activities demonstrated the use of Git and GitHub for version control, collaboration, branch management, and project integration within a DevOps </w:t>
+      </w:r>
+      <w:proofErr w:type="spellStart"/>
+      <w:proofErr w:type="gramStart"/>
+      <w:r>
+        <w:t>environment.</w:t>
+      </w:r>
+      <w:r>
+        <w:t>Below</w:t>
+      </w:r>
+      <w:proofErr w:type="spellEnd"/>
+      <w:proofErr w:type="gramEnd"/>
+      <w:r>
+        <w:t xml:space="preserve"> this can all be seen.</w:t>
+      </w:r>
+    </w:p>
+    <w:p>
       <w:pPr>
         <w:pStyle w:val="Heading1"/>
       </w:pPr>
@@ -2533,6 +2596,59 @@
                     <a:xfrm>
                       <a:off x="0" y="0"/>
                       <a:ext cx="5731510" cy="2051685"/>
+                    </a:xfrm>
+                    <a:prstGeom prst="rect">
+                      <a:avLst/>
+                    </a:prstGeom>
+                  </pic:spPr>
+                </pic:pic>
+              </a:graphicData>
+            </a:graphic>
+          </wp:inline>
+        </w:drawing>
+      </w:r>
+    </w:p>
+    <w:p>
+      <w:r>
+        <w:t>All project files up to date on the repository</w:t>
+      </w:r>
+    </w:p>
+    <w:p>
+      <w:r>
+        <w:rPr>
+          <w:noProof/>
+        </w:rPr>
+        <w:drawing>
+          <wp:inline distT="0" distB="0" distL="0" distR="0" wp14:anchorId="4ECD4A1D" wp14:editId="11A6A310">
+            <wp:extent cx="5731510" cy="2181860"/>
+            <wp:effectExtent l="0" t="0" r="2540" b="8890"/>
+            <wp:docPr id="319437731" name="Picture 2"/>
+            <wp:cNvGraphicFramePr>
+              <a:graphicFrameLocks xmlns:a="http://schemas.openxmlformats.org/drawingml/2006/main" noChangeAspect="1"/>
+            </wp:cNvGraphicFramePr>
+            <a:graphic xmlns:a="http://schemas.openxmlformats.org/drawingml/2006/main">
+              <a:graphicData uri="http://schemas.openxmlformats.org/drawingml/2006/picture">
+                <pic:pic xmlns:pic="http://schemas.openxmlformats.org/drawingml/2006/picture">
+                  <pic:nvPicPr>
+                    <pic:cNvPr id="319437731" name="Picture 319437731"/>
+                    <pic:cNvPicPr/>
+                  </pic:nvPicPr>
+                  <pic:blipFill>
+                    <a:blip r:embed="rId28">
+                      <a:extLst>
+                        <a:ext uri="{28A0092B-C50C-407E-A947-70E740481C1C}">
+                          <a14:useLocalDpi xmlns:a14="http://schemas.microsoft.com/office/drawing/2010/main" val="0"/>
+                        </a:ext>
+                      </a:extLst>
+                    </a:blip>
+                    <a:stretch>
+                      <a:fillRect/>
+                    </a:stretch>
+                  </pic:blipFill>
+                  <pic:spPr>
+                    <a:xfrm>
+                      <a:off x="0" y="0"/>
+                      <a:ext cx="5731510" cy="2181860"/>
                     </a:xfrm>
                     <a:prstGeom prst="rect">
                       <a:avLst/>
@@ -3875,6 +3991,8 @@
   </w:compat>
   <w:rsids>
     <w:rsidRoot w:val="00595F91"/>
+    <w:rsid w:val="00074CDF"/>
+    <w:rsid w:val="002D3067"/>
     <w:rsid w:val="00595F91"/>
     <w:rsid w:val="007E4AC3"/>
     <w:rsid w:val="0082304A"/>

</xml_diff>